<commit_message>
add Logout Use case
</commit_message>
<xml_diff>
--- a/Requirement List.docx
+++ b/Requirement List.docx
@@ -183,6 +183,11 @@
               </w:rPr>
               <w:t xml:space="preserve">사용자가 시스템을 이용하기 위해 ID, 비밀번호, 이름, 전화번호, 이메일을 입력하여 회원 가입을 할 수 있어야 한다.</w:t>
             </w:r>
+            <w:r>
+              <w:rPr>
+                <w:rtl w:val="0"/>
+              </w:rPr>
+            </w:r>
           </w:p>
         </w:tc>
         <w:tc>
@@ -203,6 +208,11 @@
                 <w:rtl w:val="0"/>
               </w:rPr>
               <w:t xml:space="preserve">회원가입</w:t>
+            </w:r>
+            <w:r>
+              <w:rPr>
+                <w:rtl w:val="0"/>
+              </w:rPr>
             </w:r>
           </w:p>
         </w:tc>
@@ -250,6 +260,11 @@
               </w:rPr>
               <w:t xml:space="preserve">회원이 언제든 회원 탈퇴를 할 수 있어야 한다.</w:t>
             </w:r>
+            <w:r>
+              <w:rPr>
+                <w:rtl w:val="0"/>
+              </w:rPr>
+            </w:r>
           </w:p>
         </w:tc>
         <w:tc>
@@ -270,6 +285,11 @@
                 <w:rtl w:val="0"/>
               </w:rPr>
               <w:t xml:space="preserve">회원 탈퇴</w:t>
+            </w:r>
+            <w:r>
+              <w:rPr>
+                <w:rtl w:val="0"/>
+              </w:rPr>
             </w:r>
           </w:p>
         </w:tc>
@@ -317,6 +337,11 @@
               </w:rPr>
               <w:t xml:space="preserve">관리자와 회원 모두 ID와 비밀번호로 로그인 할 수 있어야 한다.</w:t>
             </w:r>
+            <w:r>
+              <w:rPr>
+                <w:rtl w:val="0"/>
+              </w:rPr>
+            </w:r>
           </w:p>
         </w:tc>
         <w:tc>
@@ -337,6 +362,11 @@
                 <w:rtl w:val="0"/>
               </w:rPr>
               <w:t xml:space="preserve">로그인</w:t>
+            </w:r>
+            <w:r>
+              <w:rPr>
+                <w:rtl w:val="0"/>
+              </w:rPr>
             </w:r>
           </w:p>
         </w:tc>
@@ -370,40 +400,40 @@
           <w:p>
             <w:pPr>
               <w:rPr>
-                <w:rFonts w:ascii="Helvetica Neue" w:cs="Helvetica Neue" w:eastAsia="Helvetica Neue" w:hAnsi="Helvetica Neue"/>
-                <w:sz w:val="20"/>
-                <w:szCs w:val="20"/>
-              </w:rPr>
-            </w:pPr>
-            <w:r>
-              <w:rPr>
-                <w:rFonts w:ascii="Arial Unicode MS" w:cs="Arial Unicode MS" w:eastAsia="Arial Unicode MS" w:hAnsi="Arial Unicode MS"/>
-                <w:sz w:val="20"/>
-                <w:szCs w:val="20"/>
-                <w:rtl w:val="0"/>
-              </w:rPr>
-              <w:t xml:space="preserve">관리자가 원하는 설문을 등록할 수 있어야 한다. 설문 등록 시 설문 제목, 설명, 문항, 응답 항목, 시작 및 마감시간 등을 포함한다.</w:t>
-            </w:r>
-          </w:p>
-        </w:tc>
-        <w:tc>
-          <w:tcPr/>
-          <w:p>
-            <w:pPr>
-              <w:rPr>
-                <w:rFonts w:ascii="Helvetica Neue" w:cs="Helvetica Neue" w:eastAsia="Helvetica Neue" w:hAnsi="Helvetica Neue"/>
-                <w:sz w:val="20"/>
-                <w:szCs w:val="20"/>
-              </w:rPr>
-            </w:pPr>
-            <w:r>
-              <w:rPr>
-                <w:rFonts w:ascii="Arial Unicode MS" w:cs="Arial Unicode MS" w:eastAsia="Arial Unicode MS" w:hAnsi="Arial Unicode MS"/>
-                <w:sz w:val="20"/>
-                <w:szCs w:val="20"/>
-                <w:rtl w:val="0"/>
-              </w:rPr>
-              <w:t xml:space="preserve">설문 등록</w:t>
+                <w:rFonts w:ascii="Arimo" w:cs="Arimo" w:eastAsia="Arimo" w:hAnsi="Arimo"/>
+                <w:sz w:val="20"/>
+                <w:szCs w:val="20"/>
+              </w:rPr>
+            </w:pPr>
+            <w:r>
+              <w:rPr>
+                <w:rFonts w:ascii="Arial Unicode MS" w:cs="Arial Unicode MS" w:eastAsia="Arial Unicode MS" w:hAnsi="Arial Unicode MS"/>
+                <w:sz w:val="20"/>
+                <w:szCs w:val="20"/>
+                <w:rtl w:val="0"/>
+              </w:rPr>
+              <w:t xml:space="preserve">관리자와 회원 모두 언제든 로그아웃 할 수 있어야 한다.</w:t>
+            </w:r>
+          </w:p>
+        </w:tc>
+        <w:tc>
+          <w:tcPr/>
+          <w:p>
+            <w:pPr>
+              <w:rPr>
+                <w:rFonts w:ascii="Arimo" w:cs="Arimo" w:eastAsia="Arimo" w:hAnsi="Arimo"/>
+                <w:sz w:val="20"/>
+                <w:szCs w:val="20"/>
+              </w:rPr>
+            </w:pPr>
+            <w:r>
+              <w:rPr>
+                <w:rFonts w:ascii="Arial Unicode MS" w:cs="Arial Unicode MS" w:eastAsia="Arial Unicode MS" w:hAnsi="Arial Unicode MS"/>
+                <w:sz w:val="20"/>
+                <w:szCs w:val="20"/>
+                <w:rtl w:val="0"/>
+              </w:rPr>
+              <w:t xml:space="preserve">로그아웃</w:t>
             </w:r>
           </w:p>
         </w:tc>
@@ -449,28 +479,38 @@
                 <w:szCs w:val="20"/>
                 <w:rtl w:val="0"/>
               </w:rPr>
-              <w:t xml:space="preserve">회원은 관리자가 등록된 설문들을 조회할 수 있어야 한다.</w:t>
-            </w:r>
-          </w:p>
-        </w:tc>
-        <w:tc>
-          <w:tcPr/>
-          <w:p>
-            <w:pPr>
-              <w:rPr>
-                <w:rFonts w:ascii="Helvetica Neue" w:cs="Helvetica Neue" w:eastAsia="Helvetica Neue" w:hAnsi="Helvetica Neue"/>
-                <w:sz w:val="20"/>
-                <w:szCs w:val="20"/>
-              </w:rPr>
-            </w:pPr>
-            <w:r>
-              <w:rPr>
-                <w:rFonts w:ascii="Arial Unicode MS" w:cs="Arial Unicode MS" w:eastAsia="Arial Unicode MS" w:hAnsi="Arial Unicode MS"/>
-                <w:sz w:val="20"/>
-                <w:szCs w:val="20"/>
-                <w:rtl w:val="0"/>
-              </w:rPr>
-              <w:t xml:space="preserve">설문 리스트 조회</w:t>
+              <w:t xml:space="preserve">관리자가 원하는 설문을 등록할 수 있어야 한다. 설문 등록 시 설문 제목, 설명, 문항, 응답 항목, 시작 및 마감시간 등을 포함한다.</w:t>
+            </w:r>
+            <w:r>
+              <w:rPr>
+                <w:rtl w:val="0"/>
+              </w:rPr>
+            </w:r>
+          </w:p>
+        </w:tc>
+        <w:tc>
+          <w:tcPr/>
+          <w:p>
+            <w:pPr>
+              <w:rPr>
+                <w:rFonts w:ascii="Helvetica Neue" w:cs="Helvetica Neue" w:eastAsia="Helvetica Neue" w:hAnsi="Helvetica Neue"/>
+                <w:sz w:val="20"/>
+                <w:szCs w:val="20"/>
+              </w:rPr>
+            </w:pPr>
+            <w:r>
+              <w:rPr>
+                <w:rFonts w:ascii="Arial Unicode MS" w:cs="Arial Unicode MS" w:eastAsia="Arial Unicode MS" w:hAnsi="Arial Unicode MS"/>
+                <w:sz w:val="20"/>
+                <w:szCs w:val="20"/>
+                <w:rtl w:val="0"/>
+              </w:rPr>
+              <w:t xml:space="preserve">설문 등록</w:t>
+            </w:r>
+            <w:r>
+              <w:rPr>
+                <w:rtl w:val="0"/>
+              </w:rPr>
             </w:r>
           </w:p>
         </w:tc>
@@ -516,28 +556,38 @@
                 <w:szCs w:val="20"/>
                 <w:rtl w:val="0"/>
               </w:rPr>
-              <w:t xml:space="preserve">회원은 현재 진행 중인, 향후 진행 예정인, 종료된 리스트 중 하나를 선택해 키워드를 입력하여 설문을 검색할 수 있어야 한다.</w:t>
-            </w:r>
-          </w:p>
-        </w:tc>
-        <w:tc>
-          <w:tcPr/>
-          <w:p>
-            <w:pPr>
-              <w:rPr>
-                <w:rFonts w:ascii="Helvetica Neue" w:cs="Helvetica Neue" w:eastAsia="Helvetica Neue" w:hAnsi="Helvetica Neue"/>
-                <w:sz w:val="20"/>
-                <w:szCs w:val="20"/>
-              </w:rPr>
-            </w:pPr>
-            <w:r>
-              <w:rPr>
-                <w:rFonts w:ascii="Arial Unicode MS" w:cs="Arial Unicode MS" w:eastAsia="Arial Unicode MS" w:hAnsi="Arial Unicode MS"/>
-                <w:sz w:val="20"/>
-                <w:szCs w:val="20"/>
-                <w:rtl w:val="0"/>
-              </w:rPr>
-              <w:t xml:space="preserve">설문 검색</w:t>
+              <w:t xml:space="preserve">회원은 관리자가 등록된 설문들을 조회할 수 있어야 한다.</w:t>
+            </w:r>
+            <w:r>
+              <w:rPr>
+                <w:rtl w:val="0"/>
+              </w:rPr>
+            </w:r>
+          </w:p>
+        </w:tc>
+        <w:tc>
+          <w:tcPr/>
+          <w:p>
+            <w:pPr>
+              <w:rPr>
+                <w:rFonts w:ascii="Helvetica Neue" w:cs="Helvetica Neue" w:eastAsia="Helvetica Neue" w:hAnsi="Helvetica Neue"/>
+                <w:sz w:val="20"/>
+                <w:szCs w:val="20"/>
+              </w:rPr>
+            </w:pPr>
+            <w:r>
+              <w:rPr>
+                <w:rFonts w:ascii="Arial Unicode MS" w:cs="Arial Unicode MS" w:eastAsia="Arial Unicode MS" w:hAnsi="Arial Unicode MS"/>
+                <w:sz w:val="20"/>
+                <w:szCs w:val="20"/>
+                <w:rtl w:val="0"/>
+              </w:rPr>
+              <w:t xml:space="preserve">설문 리스트 조회</w:t>
+            </w:r>
+            <w:r>
+              <w:rPr>
+                <w:rtl w:val="0"/>
+              </w:rPr>
             </w:r>
           </w:p>
         </w:tc>
@@ -583,28 +633,38 @@
                 <w:szCs w:val="20"/>
                 <w:rtl w:val="0"/>
               </w:rPr>
-              <w:t xml:space="preserve">회원은 검색된 리스트 화면에서 원하는 설문을 선택하여 설문 제목, 설명, 문항, 응답 항목, 설문 시작 시각, 마감 시각 등을 확인할 수 있어야 한다.</w:t>
-            </w:r>
-          </w:p>
-        </w:tc>
-        <w:tc>
-          <w:tcPr/>
-          <w:p>
-            <w:pPr>
-              <w:rPr>
-                <w:rFonts w:ascii="Helvetica Neue" w:cs="Helvetica Neue" w:eastAsia="Helvetica Neue" w:hAnsi="Helvetica Neue"/>
-                <w:sz w:val="20"/>
-                <w:szCs w:val="20"/>
-              </w:rPr>
-            </w:pPr>
-            <w:r>
-              <w:rPr>
-                <w:rFonts w:ascii="Arial Unicode MS" w:cs="Arial Unicode MS" w:eastAsia="Arial Unicode MS" w:hAnsi="Arial Unicode MS"/>
-                <w:sz w:val="20"/>
-                <w:szCs w:val="20"/>
-                <w:rtl w:val="0"/>
-              </w:rPr>
-              <w:t xml:space="preserve">설문 상세 정보 조회</w:t>
+              <w:t xml:space="preserve">회원은 현재 진행 중인, 향후 진행 예정인, 종료된 리스트 중 하나를 선택해 키워드를 입력하여 설문을 검색할 수 있어야 한다.</w:t>
+            </w:r>
+            <w:r>
+              <w:rPr>
+                <w:rtl w:val="0"/>
+              </w:rPr>
+            </w:r>
+          </w:p>
+        </w:tc>
+        <w:tc>
+          <w:tcPr/>
+          <w:p>
+            <w:pPr>
+              <w:rPr>
+                <w:rFonts w:ascii="Helvetica Neue" w:cs="Helvetica Neue" w:eastAsia="Helvetica Neue" w:hAnsi="Helvetica Neue"/>
+                <w:sz w:val="20"/>
+                <w:szCs w:val="20"/>
+              </w:rPr>
+            </w:pPr>
+            <w:r>
+              <w:rPr>
+                <w:rFonts w:ascii="Arial Unicode MS" w:cs="Arial Unicode MS" w:eastAsia="Arial Unicode MS" w:hAnsi="Arial Unicode MS"/>
+                <w:sz w:val="20"/>
+                <w:szCs w:val="20"/>
+                <w:rtl w:val="0"/>
+              </w:rPr>
+              <w:t xml:space="preserve">설문 검색</w:t>
+            </w:r>
+            <w:r>
+              <w:rPr>
+                <w:rtl w:val="0"/>
+              </w:rPr>
             </w:r>
           </w:p>
         </w:tc>
@@ -650,28 +710,38 @@
                 <w:szCs w:val="20"/>
                 <w:rtl w:val="0"/>
               </w:rPr>
-              <w:t xml:space="preserve">회원은 원하는 설문에 응답할 수 있어야 한다</w:t>
-            </w:r>
-          </w:p>
-        </w:tc>
-        <w:tc>
-          <w:tcPr/>
-          <w:p>
-            <w:pPr>
-              <w:rPr>
-                <w:rFonts w:ascii="Helvetica Neue" w:cs="Helvetica Neue" w:eastAsia="Helvetica Neue" w:hAnsi="Helvetica Neue"/>
-                <w:sz w:val="20"/>
-                <w:szCs w:val="20"/>
-              </w:rPr>
-            </w:pPr>
-            <w:r>
-              <w:rPr>
-                <w:rFonts w:ascii="Arial Unicode MS" w:cs="Arial Unicode MS" w:eastAsia="Arial Unicode MS" w:hAnsi="Arial Unicode MS"/>
-                <w:sz w:val="20"/>
-                <w:szCs w:val="20"/>
-                <w:rtl w:val="0"/>
-              </w:rPr>
-              <w:t xml:space="preserve">설문 응답</w:t>
+              <w:t xml:space="preserve">회원은 검색된 리스트 화면에서 원하는 설문을 선택하여 설문 제목, 설명, 문항, 응답 항목, 설문 시작 시각, 마감 시각 등을 확인할 수 있어야 한다.</w:t>
+            </w:r>
+            <w:r>
+              <w:rPr>
+                <w:rtl w:val="0"/>
+              </w:rPr>
+            </w:r>
+          </w:p>
+        </w:tc>
+        <w:tc>
+          <w:tcPr/>
+          <w:p>
+            <w:pPr>
+              <w:rPr>
+                <w:rFonts w:ascii="Helvetica Neue" w:cs="Helvetica Neue" w:eastAsia="Helvetica Neue" w:hAnsi="Helvetica Neue"/>
+                <w:sz w:val="20"/>
+                <w:szCs w:val="20"/>
+              </w:rPr>
+            </w:pPr>
+            <w:r>
+              <w:rPr>
+                <w:rFonts w:ascii="Arial Unicode MS" w:cs="Arial Unicode MS" w:eastAsia="Arial Unicode MS" w:hAnsi="Arial Unicode MS"/>
+                <w:sz w:val="20"/>
+                <w:szCs w:val="20"/>
+                <w:rtl w:val="0"/>
+              </w:rPr>
+              <w:t xml:space="preserve">설문 상세 정보 조회</w:t>
+            </w:r>
+            <w:r>
+              <w:rPr>
+                <w:rtl w:val="0"/>
+              </w:rPr>
             </w:r>
           </w:p>
         </w:tc>
@@ -717,38 +787,34 @@
                 <w:szCs w:val="20"/>
                 <w:rtl w:val="0"/>
               </w:rPr>
-              <w:t xml:space="preserve">회원은 본인이 응답한 모든 설문 정보를 한 화면에서 조회 할 수 있다.</w:t>
-            </w:r>
-          </w:p>
-        </w:tc>
-        <w:tc>
-          <w:tcPr/>
-          <w:p>
-            <w:pPr>
-              <w:rPr>
-                <w:rFonts w:ascii="Helvetica Neue" w:cs="Helvetica Neue" w:eastAsia="Helvetica Neue" w:hAnsi="Helvetica Neue"/>
-                <w:sz w:val="20"/>
-                <w:szCs w:val="20"/>
-              </w:rPr>
-            </w:pPr>
-            <w:r>
-              <w:rPr>
-                <w:rFonts w:ascii="Arial Unicode MS" w:cs="Arial Unicode MS" w:eastAsia="Arial Unicode MS" w:hAnsi="Arial Unicode MS"/>
-                <w:sz w:val="20"/>
-                <w:szCs w:val="20"/>
-                <w:rtl w:val="0"/>
-              </w:rPr>
-              <w:t xml:space="preserve">응답 설문 조회</w:t>
-            </w:r>
-          </w:p>
-          <w:p>
-            <w:pPr>
-              <w:rPr>
-                <w:rFonts w:ascii="Helvetica Neue" w:cs="Helvetica Neue" w:eastAsia="Helvetica Neue" w:hAnsi="Helvetica Neue"/>
-                <w:sz w:val="20"/>
-                <w:szCs w:val="20"/>
-              </w:rPr>
-            </w:pPr>
+              <w:t xml:space="preserve">회원은 원하는 설문에 응답할 수 있어야 한다</w:t>
+            </w:r>
+            <w:r>
+              <w:rPr>
+                <w:rtl w:val="0"/>
+              </w:rPr>
+            </w:r>
+          </w:p>
+        </w:tc>
+        <w:tc>
+          <w:tcPr/>
+          <w:p>
+            <w:pPr>
+              <w:rPr>
+                <w:rFonts w:ascii="Helvetica Neue" w:cs="Helvetica Neue" w:eastAsia="Helvetica Neue" w:hAnsi="Helvetica Neue"/>
+                <w:sz w:val="20"/>
+                <w:szCs w:val="20"/>
+              </w:rPr>
+            </w:pPr>
+            <w:r>
+              <w:rPr>
+                <w:rFonts w:ascii="Arial Unicode MS" w:cs="Arial Unicode MS" w:eastAsia="Arial Unicode MS" w:hAnsi="Arial Unicode MS"/>
+                <w:sz w:val="20"/>
+                <w:szCs w:val="20"/>
+                <w:rtl w:val="0"/>
+              </w:rPr>
+              <w:t xml:space="preserve">설문 응답</w:t>
+            </w:r>
             <w:r>
               <w:rPr>
                 <w:rtl w:val="0"/>
@@ -798,28 +864,52 @@
                 <w:szCs w:val="20"/>
                 <w:rtl w:val="0"/>
               </w:rPr>
-              <w:t xml:space="preserve">회원은 현재 진행중인 설문에 대해 자신이 제출한 응답을 수정 할 수 있다.</w:t>
-            </w:r>
-          </w:p>
-        </w:tc>
-        <w:tc>
-          <w:tcPr/>
-          <w:p>
-            <w:pPr>
-              <w:rPr>
-                <w:rFonts w:ascii="Helvetica Neue" w:cs="Helvetica Neue" w:eastAsia="Helvetica Neue" w:hAnsi="Helvetica Neue"/>
-                <w:sz w:val="20"/>
-                <w:szCs w:val="20"/>
-              </w:rPr>
-            </w:pPr>
-            <w:r>
-              <w:rPr>
-                <w:rFonts w:ascii="Arial Unicode MS" w:cs="Arial Unicode MS" w:eastAsia="Arial Unicode MS" w:hAnsi="Arial Unicode MS"/>
-                <w:sz w:val="20"/>
-                <w:szCs w:val="20"/>
-                <w:rtl w:val="0"/>
-              </w:rPr>
-              <w:t xml:space="preserve">응답 수정</w:t>
+              <w:t xml:space="preserve">회원은 본인이 응답한 모든 설문 정보를 한 화면에서 조회 할 수 있다.</w:t>
+            </w:r>
+            <w:r>
+              <w:rPr>
+                <w:rtl w:val="0"/>
+              </w:rPr>
+            </w:r>
+          </w:p>
+        </w:tc>
+        <w:tc>
+          <w:tcPr/>
+          <w:p>
+            <w:pPr>
+              <w:rPr>
+                <w:rFonts w:ascii="Helvetica Neue" w:cs="Helvetica Neue" w:eastAsia="Helvetica Neue" w:hAnsi="Helvetica Neue"/>
+                <w:sz w:val="20"/>
+                <w:szCs w:val="20"/>
+              </w:rPr>
+            </w:pPr>
+            <w:r>
+              <w:rPr>
+                <w:rFonts w:ascii="Arial Unicode MS" w:cs="Arial Unicode MS" w:eastAsia="Arial Unicode MS" w:hAnsi="Arial Unicode MS"/>
+                <w:sz w:val="20"/>
+                <w:szCs w:val="20"/>
+                <w:rtl w:val="0"/>
+              </w:rPr>
+              <w:t xml:space="preserve">응답 설문 조회</w:t>
+            </w:r>
+            <w:r>
+              <w:rPr>
+                <w:rtl w:val="0"/>
+              </w:rPr>
+            </w:r>
+          </w:p>
+          <w:p>
+            <w:pPr>
+              <w:rPr>
+                <w:rFonts w:ascii="Helvetica Neue" w:cs="Helvetica Neue" w:eastAsia="Helvetica Neue" w:hAnsi="Helvetica Neue"/>
+                <w:sz w:val="20"/>
+                <w:szCs w:val="20"/>
+              </w:rPr>
+            </w:pPr>
+            <w:r>
+              <w:rPr>
+                <w:rtl w:val="0"/>
+              </w:rPr>
             </w:r>
           </w:p>
         </w:tc>
@@ -865,8 +955,90 @@
                 <w:szCs w:val="20"/>
                 <w:rtl w:val="0"/>
               </w:rPr>
+              <w:t xml:space="preserve">회원은 현재 진행중인 설문에 대해 자신이 제출한 응답을 수정 할 수 있다.</w:t>
+            </w:r>
+            <w:r>
+              <w:rPr>
+                <w:rtl w:val="0"/>
+              </w:rPr>
+            </w:r>
+          </w:p>
+        </w:tc>
+        <w:tc>
+          <w:tcPr/>
+          <w:p>
+            <w:pPr>
+              <w:rPr>
+                <w:rFonts w:ascii="Helvetica Neue" w:cs="Helvetica Neue" w:eastAsia="Helvetica Neue" w:hAnsi="Helvetica Neue"/>
+                <w:sz w:val="20"/>
+                <w:szCs w:val="20"/>
+              </w:rPr>
+            </w:pPr>
+            <w:r>
+              <w:rPr>
+                <w:rFonts w:ascii="Arial Unicode MS" w:cs="Arial Unicode MS" w:eastAsia="Arial Unicode MS" w:hAnsi="Arial Unicode MS"/>
+                <w:sz w:val="20"/>
+                <w:szCs w:val="20"/>
+                <w:rtl w:val="0"/>
+              </w:rPr>
+              <w:t xml:space="preserve">응답 수정</w:t>
+            </w:r>
+            <w:r>
+              <w:rPr>
+                <w:rtl w:val="0"/>
+              </w:rPr>
+            </w:r>
+          </w:p>
+        </w:tc>
+      </w:tr>
+      <w:tr>
+        <w:trPr>
+          <w:cantSplit w:val="0"/>
+          <w:trHeight w:val="567" w:hRule="atLeast"/>
+          <w:tblHeader w:val="0"/>
+        </w:trPr>
+        <w:tc>
+          <w:tcPr/>
+          <w:p>
+            <w:pPr>
+              <w:jc w:val="center"/>
+              <w:rPr>
+                <w:rFonts w:ascii="Helvetica Neue" w:cs="Helvetica Neue" w:eastAsia="Helvetica Neue" w:hAnsi="Helvetica Neue"/>
+              </w:rPr>
+            </w:pPr>
+            <w:r>
+              <w:rPr>
+                <w:rFonts w:ascii="Helvetica Neue" w:cs="Helvetica Neue" w:eastAsia="Helvetica Neue" w:hAnsi="Helvetica Neue"/>
+                <w:rtl w:val="0"/>
+              </w:rPr>
+              <w:t xml:space="preserve">12</w:t>
+            </w:r>
+          </w:p>
+        </w:tc>
+        <w:tc>
+          <w:tcPr/>
+          <w:p>
+            <w:pPr>
+              <w:rPr>
+                <w:rFonts w:ascii="Helvetica Neue" w:cs="Helvetica Neue" w:eastAsia="Helvetica Neue" w:hAnsi="Helvetica Neue"/>
+                <w:sz w:val="20"/>
+                <w:szCs w:val="20"/>
+              </w:rPr>
+            </w:pPr>
+            <w:r>
+              <w:rPr>
+                <w:rFonts w:ascii="Arial Unicode MS" w:cs="Arial Unicode MS" w:eastAsia="Arial Unicode MS" w:hAnsi="Arial Unicode MS"/>
+                <w:sz w:val="20"/>
+                <w:szCs w:val="20"/>
+                <w:rtl w:val="0"/>
+              </w:rPr>
               <w:t xml:space="preserve">관리자가 최근 1주일, 1개월, 1년 단위로 전체 설문 수, 종료된 설문 수, 총 응답 수에 대한 통계 정보를 조회할 수 있어야 한다.</w:t>
             </w:r>
+            <w:r>
+              <w:rPr>
+                <w:rtl w:val="0"/>
+              </w:rPr>
+            </w:r>
           </w:p>
         </w:tc>
         <w:tc>
@@ -887,6 +1059,11 @@
                 <w:rtl w:val="0"/>
               </w:rPr>
               <w:t xml:space="preserve">설문 응답 통계 조회</w:t>
+            </w:r>
+            <w:r>
+              <w:rPr>
+                <w:rtl w:val="0"/>
+              </w:rPr>
             </w:r>
           </w:p>
         </w:tc>

</xml_diff>